<commit_message>
fix: convention templates - SIRET placeholder, signature table layout, civility placeholder
</commit_message>
<xml_diff>
--- a/views/CONVENTION_CPF_CAJA.docx
+++ b/views/CONVENTION_CPF_CAJA.docx
@@ -140,7 +140,7 @@
           <w:rFonts w:ascii="Avenir Next Regular" w:eastAsia="Calibri" w:hAnsi="Avenir Next Regular" w:cs="Browallia New"/>
           <w:lang w:val="fr-FR"/>
         </w:rPr>
-        <w:t xml:space="preserve">Et Madame {{CANDIDATE_NAME}}, est conclue la convention suivante, en application des dispositions du Livre III de la sixième partie du code du travail portant organisation de la formation professionnelle. </w:t>
+        <w:t xml:space="preserve">Et {{CIVILITY}} {{CANDIDATE_NAME}}, est conclue la convention suivante, en application des dispositions du Livre III de la sixième partie du code du travail portant organisation de la formation professionnelle. </w:t>
       </w:r>
     </w:p>
     <w:p>
@@ -369,6 +369,8 @@
         <w:ind w:left="426" w:right="-431"/>
         <w:rPr>
           <w:rFonts w:ascii="Avenir Next Regular" w:eastAsia="Calibri" w:hAnsi="Avenir Next Regular" w:cs="Browallia New"/>
+          <w:b/>
+          <w:bCs/>
           <w:lang w:val="fr-FR"/>
         </w:rPr>
       </w:pPr>
@@ -377,7 +379,16 @@
           <w:rFonts w:ascii="Avenir Next Regular" w:eastAsia="Calibri" w:hAnsi="Avenir Next Regular" w:cs="Browallia New"/>
           <w:lang w:val="fr-FR"/>
         </w:rPr>
-        <w:t>Durée de l’action de formation : {{TOTAL_HOURS}} heures</w:t>
+        <w:t xml:space="preserve">Durée de l’action de formation : </w:t>
+      </w:r>
+      <w:r>
+        <w:rPr>
+          <w:rFonts w:ascii="Avenir Next Regular" w:eastAsia="Calibri" w:hAnsi="Avenir Next Regular" w:cs="Browallia New"/>
+          <w:b/>
+          <w:bCs/>
+          <w:lang w:val="fr-FR"/>
+        </w:rPr>
+        <w:t>{{TOTAL_HOURS}} heures</w:t>
       </w:r>
     </w:p>
     <w:p>
@@ -429,7 +440,16 @@
           <w:rFonts w:ascii="Avenir Next Regular" w:eastAsia="Calibri" w:hAnsi="Avenir Next Regular" w:cs="Browallia New"/>
           <w:lang w:val="fr-FR"/>
         </w:rPr>
-        <w:t>Dates : {{DATE_STR}}</w:t>
+        <w:t xml:space="preserve">Dates : </w:t>
+      </w:r>
+      <w:r>
+        <w:rPr>
+          <w:rFonts w:ascii="Avenir Next Regular" w:eastAsia="Calibri" w:hAnsi="Avenir Next Regular" w:cs="Browallia New"/>
+          <w:b/>
+          <w:bCs/>
+          <w:lang w:val="fr-FR"/>
+        </w:rPr>
+        <w:t>{{DATE_STR}}</w:t>
       </w:r>
     </w:p>
     <w:p>
@@ -686,7 +706,7 @@
           <w:noProof/>
           <w:lang w:val="fr-FR"/>
         </w:rPr>
-        <w:t>Madame {{CANDIDATE_NAME}}</w:t>
+        <w:t>{{CIVILITY}} {{CANDIDATE_NAME}}</w:t>
       </w:r>
     </w:p>
     <w:p>
@@ -1223,27 +1243,6 @@
         </w:rPr>
         <w:t>Fait en double exemplaire, à {{SIGN_CITY}} le {{TODAY}}</w:t>
       </w:r>
-      <w:r>
-        <w:rPr>
-          <w:rFonts w:ascii="Avenir Next Regular" w:eastAsia="Calibri" w:hAnsi="Avenir Next Regular" w:cs="Browallia New"/>
-          <w:lang w:val="fr-FR"/>
-        </w:rPr>
-        <w:tab/>
-      </w:r>
-      <w:r>
-        <w:rPr>
-          <w:rFonts w:ascii="Avenir Next Regular" w:eastAsia="Calibri" w:hAnsi="Avenir Next Regular" w:cs="Browallia New"/>
-          <w:lang w:val="fr-FR"/>
-        </w:rPr>
-        <w:tab/>
-      </w:r>
-      <w:r>
-        <w:rPr>
-          <w:rFonts w:ascii="Avenir Next Regular" w:eastAsia="Calibri" w:hAnsi="Avenir Next Regular" w:cs="Browallia New"/>
-          <w:lang w:val="fr-FR"/>
-        </w:rPr>
-        <w:tab/>
-      </w:r>
     </w:p>
     <w:p>
       <w:pPr>
@@ -1257,67 +1256,166 @@
         </w:rPr>
       </w:pPr>
     </w:p>
-    <w:p>
-      <w:pPr>
-        <w:pStyle w:val="Normal10"/>
-        <w:ind w:left="-426" w:right="-431"/>
-        <w:rPr>
-          <w:rFonts w:ascii="Avenir Next Regular" w:hAnsi="Avenir Next Regular"/>
-          <w:b/>
-          <w:bCs/>
-          <w:color w:val="1F497D" w:themeColor="text2"/>
-          <w:lang w:val="fr-FR"/>
-        </w:rPr>
-        <w:sectPr>
-          <w:type w:val="continuous"/>
-          <w:pgSz w:w="11900" w:h="16820" w:code="297"/>
-          <w:pgMar w:top="1334" w:right="1274" w:bottom="1005" w:left="1418" w:header="0" w:footer="1106" w:gutter="0"/>
-          <w:cols w:space="708"/>
-          <w:docGrid w:linePitch="360"/>
-        </w:sectPr>
-      </w:pPr>
-      <w:r>
-        <w:rPr>
-          <w:rFonts w:ascii="Avenir Next Regular" w:hAnsi="Avenir Next Regular"/>
-          <w:b/>
-          <w:bCs/>
-          <w:color w:val="1F497D" w:themeColor="text2"/>
-          <w:lang w:val="fr-FR"/>
-        </w:rPr>
-        <w:t>Pour Madame {{CANDIDATE_NAME}}</w:t>
-      </w:r>
-      <w:r>
-        <w:rPr>
-          <w:rFonts w:ascii="Avenir Next Regular" w:hAnsi="Avenir Next Regular"/>
-          <w:b/>
-          <w:bCs/>
-          <w:color w:val="1F497D" w:themeColor="text2"/>
-          <w:lang w:val="fr-FR"/>
-        </w:rPr>
-        <w:tab/>
-      </w:r>
-      <w:r>
-        <w:rPr>
-          <w:rFonts w:ascii="Avenir Next Regular" w:hAnsi="Avenir Next Regular"/>
-          <w:b/>
-          <w:bCs/>
-          <w:color w:val="1F497D" w:themeColor="text2"/>
-          <w:lang w:val="fr-FR"/>
-        </w:rPr>
-        <w:tab/>
-      </w:r>
-      <w:r>
-        <w:rPr>
-          <w:rFonts w:ascii="Avenir Next Regular" w:hAnsi="Avenir Next Regular"/>
-          <w:b/>
-          <w:bCs/>
-          <w:color w:val="1F497D" w:themeColor="text2"/>
-          <w:lang w:val="fr-FR"/>
-        </w:rPr>
-        <w:tab/>
-        <w:t>Pour l’organisme LINGUAID FRANCE</w:t>
-      </w:r>
-    </w:p>
+    <w:tbl>
+      <w:tblPr>
+        <w:tblW w:w="9360" w:type="dxa"/>
+        <w:tblLook w:val="04A0" w:firstRow="1" w:lastRow="0" w:firstColumn="1" w:lastColumn="0" w:noHBand="0" w:noVBand="1"/>
+      </w:tblPr>
+      <w:tblGrid>
+        <w:gridCol w:w="4680"/>
+        <w:gridCol w:w="4680"/>
+      </w:tblGrid>
+      <w:tr>
+        <w:tc>
+          <w:tcPr>
+            <w:tcW w:w="4680" w:type="dxa"/>
+          </w:tcPr>
+          <w:p>
+            <w:pPr>
+              <w:spacing w:after="120"/>
+            </w:pPr>
+            <w:r>
+              <w:rPr>
+                <w:rFonts w:ascii="Avenir Next Regular" w:hAnsi="Avenir Next Regular"/>
+                <w:b/>
+                <w:bCs/>
+                <w:color w:val="1F497D" w:themeColor="text2"/>
+              </w:rPr>
+              <w:t>Pour {{CIVILITY}} {{CANDIDATE_NAME}}</w:t>
+            </w:r>
+          </w:p>
+        </w:tc>
+        <w:tc>
+          <w:tcPr>
+            <w:tcW w:w="4680" w:type="dxa"/>
+          </w:tcPr>
+          <w:p>
+            <w:pPr>
+              <w:spacing w:after="120"/>
+            </w:pPr>
+            <w:r>
+              <w:rPr>
+                <w:rFonts w:ascii="Avenir Next Regular" w:hAnsi="Avenir Next Regular"/>
+                <w:b/>
+                <w:bCs/>
+                <w:color w:val="1F497D" w:themeColor="text2"/>
+              </w:rPr>
+              <w:t>Pour l’organisme LINGUAID FRANCE</w:t>
+            </w:r>
+          </w:p>
+        </w:tc>
+      </w:tr>
+      <w:tr>
+        <w:tc>
+          <w:tcPr>
+            <w:tcW w:w="4680" w:type="dxa"/>
+          </w:tcPr>
+          <w:p>
+            <w:pPr>
+              <w:spacing w:after="120"/>
+            </w:pPr>
+          </w:p>
+        </w:tc>
+        <w:tc>
+          <w:tcPr>
+            <w:tcW w:w="4680" w:type="dxa"/>
+          </w:tcPr>
+          <w:p>
+            <w:pPr>
+              <w:spacing w:after="120"/>
+            </w:pPr>
+          </w:p>
+        </w:tc>
+      </w:tr>
+      <w:tr>
+        <w:tc>
+          <w:tcPr>
+            <w:tcW w:w="4680" w:type="dxa"/>
+          </w:tcPr>
+          <w:p>
+            <w:pPr>
+              <w:spacing w:after="120"/>
+            </w:pPr>
+          </w:p>
+        </w:tc>
+        <w:tc>
+          <w:tcPr>
+            <w:tcW w:w="4680" w:type="dxa"/>
+          </w:tcPr>
+          <w:p>
+            <w:pPr>
+              <w:spacing w:after="120"/>
+            </w:pPr>
+          </w:p>
+        </w:tc>
+      </w:tr>
+      <w:tr>
+        <w:tc>
+          <w:tcPr>
+            <w:tcW w:w="4680" w:type="dxa"/>
+          </w:tcPr>
+          <w:p>
+            <w:pPr>
+              <w:spacing w:after="120"/>
+            </w:pPr>
+          </w:p>
+        </w:tc>
+        <w:tc>
+          <w:tcPr>
+            <w:tcW w:w="4680" w:type="dxa"/>
+          </w:tcPr>
+          <w:p>
+            <w:pPr>
+              <w:spacing w:after="120"/>
+            </w:pPr>
+          </w:p>
+        </w:tc>
+      </w:tr>
+      <w:tr>
+        <w:tc>
+          <w:tcPr>
+            <w:tcW w:w="4680" w:type="dxa"/>
+          </w:tcPr>
+          <w:p>
+            <w:pPr>
+              <w:spacing w:after="120"/>
+            </w:pPr>
+          </w:p>
+        </w:tc>
+        <w:tc>
+          <w:tcPr>
+            <w:tcW w:w="4680" w:type="dxa"/>
+          </w:tcPr>
+          <w:p>
+            <w:pPr>
+              <w:spacing w:after="120"/>
+            </w:pPr>
+          </w:p>
+        </w:tc>
+      </w:tr>
+      <w:tr>
+        <w:tc>
+          <w:tcPr>
+            <w:tcW w:w="4680" w:type="dxa"/>
+          </w:tcPr>
+          <w:p>
+            <w:pPr>
+              <w:spacing w:after="120"/>
+            </w:pPr>
+          </w:p>
+        </w:tc>
+        <w:tc>
+          <w:tcPr>
+            <w:tcW w:w="4680" w:type="dxa"/>
+          </w:tcPr>
+          <w:p>
+            <w:pPr>
+              <w:spacing w:after="120"/>
+            </w:pPr>
+          </w:p>
+        </w:tc>
+      </w:tr>
+    </w:tbl>
     <w:p>
       <w:pPr>
         <w:pStyle w:val="Normal10"/>
@@ -1472,14 +1570,14 @@
                       </a:ln>
                       <a:extLst>
                         <a:ext uri="{909E8E84-426E-40dd-AFC4-6F175D3DCCD1}">
-                          <a14:hiddenFill xmlns:a14="http://schemas.microsoft.com/office/drawing/2010/main" xmlns:w="http://schemas.openxmlformats.org/wordprocessingml/2006/main" xmlns:w10="urn:schemas-microsoft-com:office:word" xmlns:v="urn:schemas-microsoft-com:vml" xmlns:o="urn:schemas-microsoft-com:office:office" xmlns:mv="urn:schemas-microsoft-com:mac:vml" xmlns:mo="http://schemas.microsoft.com/office/mac/office/2008/main" xmlns="">
+                          <a14:hiddenFill xmlns="" xmlns:mo="http://schemas.microsoft.com/office/mac/office/2008/main" xmlns:mv="urn:schemas-microsoft-com:mac:vml" xmlns:o="urn:schemas-microsoft-com:office:office" xmlns:v="urn:schemas-microsoft-com:vml" xmlns:w10="urn:schemas-microsoft-com:office:word" xmlns:w="http://schemas.openxmlformats.org/wordprocessingml/2006/main" xmlns:a14="http://schemas.microsoft.com/office/drawing/2010/main">
                             <a:solidFill>
                               <a:srgbClr val="00CC99"/>
                             </a:solidFill>
                           </a14:hiddenFill>
                         </a:ext>
                         <a:ext uri="{91240B29-F687-4f45-9708-019B960494DF}">
-                          <a14:hiddenLine xmlns:a14="http://schemas.microsoft.com/office/drawing/2010/main" xmlns:w="http://schemas.openxmlformats.org/wordprocessingml/2006/main" xmlns:w10="urn:schemas-microsoft-com:office:word" xmlns:v="urn:schemas-microsoft-com:vml" xmlns:o="urn:schemas-microsoft-com:office:office" xmlns:mv="urn:schemas-microsoft-com:mac:vml" xmlns:mo="http://schemas.microsoft.com/office/mac/office/2008/main" xmlns="" w="9525">
+                          <a14:hiddenLine xmlns="" xmlns:mo="http://schemas.microsoft.com/office/mac/office/2008/main" xmlns:mv="urn:schemas-microsoft-com:mac:vml" xmlns:o="urn:schemas-microsoft-com:office:office" xmlns:v="urn:schemas-microsoft-com:vml" xmlns:w10="urn:schemas-microsoft-com:office:word" xmlns:w="http://schemas.openxmlformats.org/wordprocessingml/2006/main" xmlns:a14="http://schemas.microsoft.com/office/drawing/2010/main" w="9525">
                             <a:solidFill>
                               <a:srgbClr val="000000"/>
                             </a:solidFill>
@@ -1886,14 +1984,14 @@
                       </a:ln>
                       <a:extLst>
                         <a:ext uri="{909E8E84-426E-40dd-AFC4-6F175D3DCCD1}">
-                          <a14:hiddenFill xmlns:a14="http://schemas.microsoft.com/office/drawing/2010/main" xmlns:w="http://schemas.openxmlformats.org/wordprocessingml/2006/main" xmlns:w10="urn:schemas-microsoft-com:office:word" xmlns:v="urn:schemas-microsoft-com:vml" xmlns:o="urn:schemas-microsoft-com:office:office" xmlns:mv="urn:schemas-microsoft-com:mac:vml" xmlns:mo="http://schemas.microsoft.com/office/mac/office/2008/main" xmlns="">
+                          <a14:hiddenFill xmlns="" xmlns:mo="http://schemas.microsoft.com/office/mac/office/2008/main" xmlns:mv="urn:schemas-microsoft-com:mac:vml" xmlns:o="urn:schemas-microsoft-com:office:office" xmlns:v="urn:schemas-microsoft-com:vml" xmlns:w10="urn:schemas-microsoft-com:office:word" xmlns:w="http://schemas.openxmlformats.org/wordprocessingml/2006/main" xmlns:a14="http://schemas.microsoft.com/office/drawing/2010/main">
                             <a:solidFill>
                               <a:srgbClr val="00CC99"/>
                             </a:solidFill>
                           </a14:hiddenFill>
                         </a:ext>
                         <a:ext uri="{91240B29-F687-4f45-9708-019B960494DF}">
-                          <a14:hiddenLine xmlns:a14="http://schemas.microsoft.com/office/drawing/2010/main" xmlns:w="http://schemas.openxmlformats.org/wordprocessingml/2006/main" xmlns:w10="urn:schemas-microsoft-com:office:word" xmlns:v="urn:schemas-microsoft-com:vml" xmlns:o="urn:schemas-microsoft-com:office:office" xmlns:mv="urn:schemas-microsoft-com:mac:vml" xmlns:mo="http://schemas.microsoft.com/office/mac/office/2008/main" xmlns="" w="9525">
+                          <a14:hiddenLine xmlns="" xmlns:mo="http://schemas.microsoft.com/office/mac/office/2008/main" xmlns:mv="urn:schemas-microsoft-com:mac:vml" xmlns:o="urn:schemas-microsoft-com:office:office" xmlns:v="urn:schemas-microsoft-com:vml" xmlns:w10="urn:schemas-microsoft-com:office:word" xmlns:w="http://schemas.openxmlformats.org/wordprocessingml/2006/main" xmlns:a14="http://schemas.microsoft.com/office/drawing/2010/main" w="9525">
                             <a:solidFill>
                               <a:srgbClr val="000000"/>
                             </a:solidFill>
@@ -2366,7 +2464,7 @@
                       <a:effectLst/>
                       <a:extLst>
                         <a:ext uri="{C572A759-6A51-4108-AA02-DFA0A04FC94B}">
-                          <ma14:wrappingTextBoxFlag xmlns:ma14="http://schemas.microsoft.com/office/mac/drawingml/2011/main" xmlns:w="http://schemas.openxmlformats.org/wordprocessingml/2006/main" xmlns:w10="urn:schemas-microsoft-com:office:word" xmlns:v="urn:schemas-microsoft-com:vml" xmlns:o="urn:schemas-microsoft-com:office:office" xmlns:mv="urn:schemas-microsoft-com:mac:vml" xmlns:mo="http://schemas.microsoft.com/office/mac/office/2008/main" xmlns=""/>
+                          <ma14:wrappingTextBoxFlag xmlns="" xmlns:mo="http://schemas.microsoft.com/office/mac/office/2008/main" xmlns:mv="urn:schemas-microsoft-com:mac:vml" xmlns:o="urn:schemas-microsoft-com:office:office" xmlns:v="urn:schemas-microsoft-com:vml" xmlns:w10="urn:schemas-microsoft-com:office:word" xmlns:w="http://schemas.openxmlformats.org/wordprocessingml/2006/main" xmlns:ma14="http://schemas.microsoft.com/office/mac/drawingml/2011/main"/>
                         </a:ext>
                       </a:extLst>
                     </wps:spPr>

</xml_diff>

<commit_message>
fix: convention CPF templates prereq/target level placeholders
</commit_message>
<xml_diff>
--- a/views/CONVENTION_CPF_CAJA.docx
+++ b/views/CONVENTION_CPF_CAJA.docx
@@ -878,21 +878,19 @@
           <w:rFonts w:ascii="Avenir Next Regular" w:eastAsia="Calibri" w:hAnsi="Avenir Next Regular" w:cs="Browallia New"/>
           <w:lang w:val="en-FR"/>
         </w:rPr>
-        <w:t xml:space="preserve">Formation à distance comprenant 10 heures de coaching individuel en visioconférence et 10 heures de </w:t>
+        <w:t>Formation à distance comprenant {{COACHING_HOURS}} heures de coaching individuel en visioconférence et {{HOMEWORK_HOURS}} heures de travail guidé en autonomie (travaux dirigés ou e-learning) comprenant des activités pédagogiques structurées et planifiées avec production de livrables (écrits et oraux). Les activités en autonomie font l’objet d’un suivi par l’organisme de formation (livrables, résultats, dates de réalisation et progression). La réalisation des activités en autonomie fait partie intégrante du parcours de formation.</w:t>
       </w:r>
       <w:r>
         <w:rPr>
           <w:rFonts w:ascii="Avenir Next Regular" w:eastAsia="Calibri" w:hAnsi="Avenir Next Regular" w:cs="Browallia New"/>
           <w:lang w:val="fr-FR"/>
         </w:rPr>
-        <w:t>travail guidé en autonomie (travaux dirigés ou e-learning)</w:t>
       </w:r>
       <w:r>
         <w:rPr>
           <w:rFonts w:ascii="Avenir Next Regular" w:eastAsia="Calibri" w:hAnsi="Avenir Next Regular" w:cs="Browallia New"/>
           <w:lang w:val="en-FR"/>
         </w:rPr>
-        <w:t xml:space="preserve"> comprenant des activités pédagogiques structurées et planifiées avec production de livrables (écrits et oraux). Les activités en autonomie font l’objet d’un suivi par l’organisme de formation (livrables, résultats, dates de réalisation et progression). La réalisation des activités en autonomie fait partie intégrante du parcours de formation.</w:t>
       </w:r>
     </w:p>
     <w:p>

</xml_diff>